<commit_message>
Ajusta auxiliares normalizados e marcadores da proposta
</commit_message>
<xml_diff>
--- a/dados/modelo_proposta.docx
+++ b/dados/modelo_proposta.docx
@@ -169,6 +169,18 @@
     </w:p>
     <w:p>
       <w:pPr>
+        <w:spacing w:after="240"/>
+        <w:jc w:val="both"/>
+        <w:rPr>
+          <w:lang w:val="pt-BR"/>
+        </w:rPr>
+      </w:pPr>
+      <w:r>
+        <w:t>{{TABELA_DADOS_PROJETO}}</w:t>
+      </w:r>
+    </w:p>
+    <w:p>
+      <w:pPr>
         <w:pStyle w:val="PargrafodaLista"/>
         <w:numPr>
           <w:ilvl w:val="0"/>
@@ -428,6 +440,7 @@
         <w:rPr>
           <w:lang w:val="pt-BR"/>
         </w:rPr>
+        <w:lastRenderedPageBreak/>
         <w:t>- Constará expressamente no instrumento contratual, no plano de trabalho e no cronograma financeiro;</w:t>
       </w:r>
     </w:p>
@@ -443,7 +456,6 @@
         <w:rPr>
           <w:lang w:val="pt-BR"/>
         </w:rPr>
-        <w:lastRenderedPageBreak/>
         <w:t>- Será indicada em moeda corrente nacional;</w:t>
       </w:r>
     </w:p>
@@ -510,7 +522,21 @@
         <w:rPr>
           <w:lang w:val="pt-BR"/>
         </w:rPr>
-        <w:t>- a natureza remuneratória da Despesa Operacional e Administrativa (DOA);</w:t>
+        <w:t xml:space="preserve">- </w:t>
+      </w:r>
+      <w:proofErr w:type="gramStart"/>
+      <w:r>
+        <w:rPr>
+          <w:lang w:val="pt-BR"/>
+        </w:rPr>
+        <w:t>a</w:t>
+      </w:r>
+      <w:proofErr w:type="gramEnd"/>
+      <w:r>
+        <w:rPr>
+          <w:lang w:val="pt-BR"/>
+        </w:rPr>
+        <w:t xml:space="preserve"> natureza remuneratória da Despesa Operacional e Administrativa (DOA);</w:t>
       </w:r>
     </w:p>
     <w:p>
@@ -525,7 +551,21 @@
         <w:rPr>
           <w:lang w:val="pt-BR"/>
         </w:rPr>
-        <w:t>- a inexistência de obrigação de prestação de contas da aplicação interna da DOA;</w:t>
+        <w:t xml:space="preserve">- </w:t>
+      </w:r>
+      <w:proofErr w:type="gramStart"/>
+      <w:r>
+        <w:rPr>
+          <w:lang w:val="pt-BR"/>
+        </w:rPr>
+        <w:t>a</w:t>
+      </w:r>
+      <w:proofErr w:type="gramEnd"/>
+      <w:r>
+        <w:rPr>
+          <w:lang w:val="pt-BR"/>
+        </w:rPr>
+        <w:t xml:space="preserve"> inexistência de obrigação de prestação de contas da aplicação interna da DOA;</w:t>
       </w:r>
     </w:p>
     <w:p>
@@ -540,7 +580,21 @@
         <w:rPr>
           <w:lang w:val="pt-BR"/>
         </w:rPr>
-        <w:t>- a possibilidade de liberação da remuneração conforme cronograma financeiro, inclusive no início da execução do projeto.</w:t>
+        <w:t xml:space="preserve">- </w:t>
+      </w:r>
+      <w:proofErr w:type="gramStart"/>
+      <w:r>
+        <w:rPr>
+          <w:lang w:val="pt-BR"/>
+        </w:rPr>
+        <w:t>a</w:t>
+      </w:r>
+      <w:proofErr w:type="gramEnd"/>
+      <w:r>
+        <w:rPr>
+          <w:lang w:val="pt-BR"/>
+        </w:rPr>
+        <w:t xml:space="preserve"> possibilidade de liberação da remuneração conforme cronograma financeiro, inclusive no início da execução do projeto.</w:t>
       </w:r>
     </w:p>
     <w:p>
@@ -735,6 +789,7 @@
           <w:szCs w:val="24"/>
           <w:lang w:val="pt-BR"/>
         </w:rPr>
+        <w:lastRenderedPageBreak/>
         <w:t>Responsabilidade Técnica e Administrativa</w:t>
       </w:r>
     </w:p>
@@ -750,7 +805,6 @@
         <w:rPr>
           <w:lang w:val="pt-BR"/>
         </w:rPr>
-        <w:lastRenderedPageBreak/>
         <w:t>A responsabilidade técnica pela concepção, conteúdo, adequação orçamentária e compatibilidade dos itens e serviços com os objetivos do projeto é exclusiva da coordenação do projeto e da instituição apoiada.</w:t>
       </w:r>
     </w:p>
@@ -1143,14 +1197,8 @@
         <w:rPr>
           <w:lang w:val="pt-BR"/>
         </w:rPr>
-        <w:t xml:space="preserve">As contratações, aquisições, pagamentos e demais fluxos operacionais conduzidos pela </w:t>
-      </w:r>
-      <w:r>
-        <w:rPr>
-          <w:lang w:val="pt-BR"/>
-        </w:rPr>
         <w:lastRenderedPageBreak/>
-        <w:t>F</w:t>
+        <w:t>As contratações, aquisições, pagamentos e demais fluxos operacionais conduzidos pela F</w:t>
       </w:r>
       <w:r>
         <w:rPr>
@@ -1163,6 +1211,33 @@
           <w:lang w:val="pt-BR"/>
         </w:rPr>
         <w:t xml:space="preserve"> serão realizados exclusivamente de acordo com esses normativos, inclusive no que se refere a prazos, documentos exigidos, critérios de análise e instâncias de aprovação.</w:t>
+      </w:r>
+    </w:p>
+    <w:p>
+      <w:pPr>
+        <w:spacing w:after="240"/>
+        <w:jc w:val="both"/>
+      </w:pPr>
+      <w:r>
+        <w:t>{{TABELA_RESUMO_PARF}}</w:t>
+      </w:r>
+    </w:p>
+    <w:p>
+      <w:pPr>
+        <w:spacing w:after="240"/>
+        <w:jc w:val="both"/>
+      </w:pPr>
+    </w:p>
+    <w:p>
+      <w:pPr>
+        <w:spacing w:after="240"/>
+        <w:jc w:val="both"/>
+        <w:rPr>
+          <w:lang w:val="pt-BR"/>
+        </w:rPr>
+      </w:pPr>
+      <w:r>
+        <w:t>{{TABELA_SERVICOS_ITENS}}</w:t>
       </w:r>
     </w:p>
     <w:p>
@@ -1427,6 +1502,9 @@
           <w:lang w:val="pt-BR"/>
         </w:rPr>
       </w:pPr>
+      <w:r>
+        <w:t>{{TABELA_DOA}}</w:t>
+      </w:r>
     </w:p>
     <w:p>
       <w:pPr>
@@ -6831,7 +6909,6 @@
   <w:style w:type="character" w:default="1" w:styleId="Fontepargpadro">
     <w:name w:val="Default Paragraph Font"/>
     <w:uiPriority w:val="1"/>
-    <w:semiHidden/>
     <w:unhideWhenUsed/>
   </w:style>
   <w:style w:type="table" w:default="1" w:styleId="Tabelanormal">
@@ -7406,14 +7483,12 @@
 </file>
 
 <file path=customXml/item1.xml><?xml version="1.0" encoding="utf-8"?>
-<p:properties xmlns:p="http://schemas.microsoft.com/office/2006/metadata/properties" xmlns:xsi="http://www.w3.org/2001/XMLSchema-instance" xmlns:pc="http://schemas.microsoft.com/office/infopath/2007/PartnerControls">
-  <documentManagement>
-    <TaxCatchAll xmlns="2cc54b4f-a4b0-4e27-8a93-97b45b3e8931" xsi:nil="true"/>
-    <lcf76f155ced4ddcb4097134ff3c332f xmlns="8f955387-8602-49f3-ae81-c4ed68281756">
-      <Terms xmlns="http://schemas.microsoft.com/office/infopath/2007/PartnerControls"/>
-    </lcf76f155ced4ddcb4097134ff3c332f>
-  </documentManagement>
-</p:properties>
+<?mso-contentType ?>
+<FormTemplates xmlns="http://schemas.microsoft.com/sharepoint/v3/contenttype/forms">
+  <Display>DocumentLibraryForm</Display>
+  <Edit>DocumentLibraryForm</Edit>
+  <New>DocumentLibraryForm</New>
+</FormTemplates>
 </file>
 
 <file path=customXml/item2.xml><?xml version="1.0" encoding="utf-8"?>
@@ -7652,21 +7727,20 @@
 </file>
 
 <file path=customXml/item3.xml><?xml version="1.0" encoding="utf-8"?>
-<?mso-contentType ?>
-<FormTemplates xmlns="http://schemas.microsoft.com/sharepoint/v3/contenttype/forms">
-  <Display>DocumentLibraryForm</Display>
-  <Edit>DocumentLibraryForm</Edit>
-  <New>DocumentLibraryForm</New>
-</FormTemplates>
+<p:properties xmlns:p="http://schemas.microsoft.com/office/2006/metadata/properties" xmlns:xsi="http://www.w3.org/2001/XMLSchema-instance" xmlns:pc="http://schemas.microsoft.com/office/infopath/2007/PartnerControls">
+  <documentManagement>
+    <TaxCatchAll xmlns="2cc54b4f-a4b0-4e27-8a93-97b45b3e8931" xsi:nil="true"/>
+    <lcf76f155ced4ddcb4097134ff3c332f xmlns="8f955387-8602-49f3-ae81-c4ed68281756">
+      <Terms xmlns="http://schemas.microsoft.com/office/infopath/2007/PartnerControls"/>
+    </lcf76f155ced4ddcb4097134ff3c332f>
+  </documentManagement>
+</p:properties>
 </file>
 
 <file path=customXml/itemProps1.xml><?xml version="1.0" encoding="utf-8"?>
-<ds:datastoreItem xmlns:ds="http://schemas.openxmlformats.org/officeDocument/2006/customXml" ds:itemID="{69329715-3CF9-4BAB-B3FE-87DA764505A1}">
+<ds:datastoreItem xmlns:ds="http://schemas.openxmlformats.org/officeDocument/2006/customXml" ds:itemID="{26FFB141-2E98-4A49-A69C-B67131EECB61}">
   <ds:schemaRefs>
-    <ds:schemaRef ds:uri="http://schemas.microsoft.com/office/2006/metadata/properties"/>
-    <ds:schemaRef ds:uri="http://schemas.microsoft.com/office/infopath/2007/PartnerControls"/>
-    <ds:schemaRef ds:uri="2cc54b4f-a4b0-4e27-8a93-97b45b3e8931"/>
-    <ds:schemaRef ds:uri="8f955387-8602-49f3-ae81-c4ed68281756"/>
+    <ds:schemaRef ds:uri="http://schemas.microsoft.com/sharepoint/v3/contenttype/forms"/>
   </ds:schemaRefs>
 </ds:datastoreItem>
 </file>
@@ -7691,9 +7765,12 @@
 </file>
 
 <file path=customXml/itemProps3.xml><?xml version="1.0" encoding="utf-8"?>
-<ds:datastoreItem xmlns:ds="http://schemas.openxmlformats.org/officeDocument/2006/customXml" ds:itemID="{26FFB141-2E98-4A49-A69C-B67131EECB61}">
+<ds:datastoreItem xmlns:ds="http://schemas.openxmlformats.org/officeDocument/2006/customXml" ds:itemID="{69329715-3CF9-4BAB-B3FE-87DA764505A1}">
   <ds:schemaRefs>
-    <ds:schemaRef ds:uri="http://schemas.microsoft.com/sharepoint/v3/contenttype/forms"/>
+    <ds:schemaRef ds:uri="http://schemas.microsoft.com/office/2006/metadata/properties"/>
+    <ds:schemaRef ds:uri="http://schemas.microsoft.com/office/infopath/2007/PartnerControls"/>
+    <ds:schemaRef ds:uri="2cc54b4f-a4b0-4e27-8a93-97b45b3e8931"/>
+    <ds:schemaRef ds:uri="8f955387-8602-49f3-ae81-c4ed68281756"/>
   </ds:schemaRefs>
 </ds:datastoreItem>
 </file>
</xml_diff>